<commit_message>
26-08-25, Furious Minds bijgewerkt
</commit_message>
<xml_diff>
--- a/BlogsWord/Furieuze_Geesten.docx
+++ b/BlogsWord/Furieuze_Geesten.docx
@@ -62,25 +62,7 @@
           <w:iCs/>
           <w:lang w:val="nl-NL"/>
         </w:rPr>
-        <w:t>“</w:t>
-      </w:r>
-      <w:r>
-        <w:rPr>
-          <w:rFonts w:ascii="Courier New" w:hAnsi="Courier New" w:cs="Courier New"/>
-          <w:i/>
-          <w:iCs/>
-          <w:lang w:val="nl-NL"/>
-        </w:rPr>
-        <w:t>In het damestoilet van de Colonnade Club herinner ik me dat ik in de spiegel keek. Zelfs op dat moment voelde het allemaal onwerkelijk, bijna filmisch. Ik schudde mijn hoofd en dacht: ‘Wat een ongelooflijke klootzak.’ Vervolgens vroeg ik mezelf af: ‘Wat doe ik hier in hemelsnaam?’ Dat was het begin van het lange, langzame proces waarin ik me losmaakte uit de wereld van het conservatieve intellectuele denken. Mijn timing was goed.</w:t>
-      </w:r>
-      <w:r>
-        <w:rPr>
-          <w:rFonts w:ascii="Courier New" w:hAnsi="Courier New" w:cs="Courier New"/>
-          <w:i/>
-          <w:iCs/>
-          <w:lang w:val="nl-NL"/>
-        </w:rPr>
-        <w:t>”</w:t>
+        <w:t>“In het damestoilet van de Colonnade Club herinner ik me dat ik in de spiegel keek. Zelfs op dat moment voelde het allemaal onwerkelijk, bijna filmisch. Ik schudde mijn hoofd en dacht: ‘Wat een ongelooflijke klootzak.’ Vervolgens vroeg ik mezelf af: ‘Wat doe ik hier in hemelsnaam?’ Dat was het begin van het lange, langzame proces waarin ik me losmaakte uit de wereld van het conservatieve intellectuele denken. Mijn timing was goed.”</w:t>
       </w:r>
     </w:p>
     <w:p>
@@ -220,14 +202,21 @@
           <w:rFonts w:ascii="Courier New" w:hAnsi="Courier New" w:cs="Courier New"/>
           <w:lang w:val="nl-NL"/>
         </w:rPr>
-        <w:t>de afgelopen tien jaar</w:t>
-      </w:r>
-      <w:r>
-        <w:rPr>
-          <w:rFonts w:ascii="Courier New" w:hAnsi="Courier New" w:cs="Courier New"/>
-          <w:lang w:val="nl-NL"/>
-        </w:rPr>
-        <w:t xml:space="preserve"> rondom Donald </w:t>
+        <w:t xml:space="preserve">de afgelopen </w:t>
+      </w:r>
+      <w:r>
+        <w:rPr>
+          <w:rFonts w:ascii="Courier New" w:hAnsi="Courier New" w:cs="Courier New"/>
+          <w:lang w:val="nl-NL"/>
+        </w:rPr>
+        <w:t xml:space="preserve">jaren </w:t>
+      </w:r>
+      <w:r>
+        <w:rPr>
+          <w:rFonts w:ascii="Courier New" w:hAnsi="Courier New" w:cs="Courier New"/>
+          <w:lang w:val="nl-NL"/>
+        </w:rPr>
+        <w:t xml:space="preserve">rondom Donald </w:t>
       </w:r>
       <w:proofErr w:type="spellStart"/>
       <w:r>
@@ -266,28 +255,58 @@
           <w:rFonts w:ascii="Courier New" w:hAnsi="Courier New" w:cs="Courier New"/>
           <w:lang w:val="nl-NL"/>
         </w:rPr>
-        <w:t xml:space="preserve">Volgens haar moeten we </w:t>
-      </w:r>
-      <w:r>
-        <w:rPr>
-          <w:rFonts w:ascii="Courier New" w:hAnsi="Courier New" w:cs="Courier New"/>
-          <w:lang w:val="nl-NL"/>
-        </w:rPr>
-        <w:t xml:space="preserve">MAGA niet </w:t>
-      </w:r>
-      <w:r>
-        <w:rPr>
-          <w:rFonts w:ascii="Courier New" w:hAnsi="Courier New" w:cs="Courier New"/>
-          <w:lang w:val="nl-NL"/>
-        </w:rPr>
-        <w:t>alleen maar zien</w:t>
-      </w:r>
-      <w:r>
-        <w:rPr>
-          <w:rFonts w:ascii="Courier New" w:hAnsi="Courier New" w:cs="Courier New"/>
-          <w:lang w:val="nl-NL"/>
-        </w:rPr>
-        <w:t xml:space="preserve"> als een populistische beweging die om </w:t>
+        <w:t xml:space="preserve">Haar verhaal loopt van 2016 tot 2024. </w:t>
+      </w:r>
+      <w:r>
+        <w:rPr>
+          <w:rFonts w:ascii="Courier New" w:hAnsi="Courier New" w:cs="Courier New"/>
+          <w:lang w:val="nl-NL"/>
+        </w:rPr>
+        <w:t xml:space="preserve">Volgens </w:t>
+      </w:r>
+      <w:r>
+        <w:rPr>
+          <w:rFonts w:ascii="Courier New" w:hAnsi="Courier New" w:cs="Courier New"/>
+          <w:lang w:val="nl-NL"/>
+        </w:rPr>
+        <w:t xml:space="preserve">Field is </w:t>
+      </w:r>
+      <w:r>
+        <w:rPr>
+          <w:rFonts w:ascii="Courier New" w:hAnsi="Courier New" w:cs="Courier New"/>
+          <w:lang w:val="nl-NL"/>
+        </w:rPr>
+        <w:t xml:space="preserve">MAGA </w:t>
+      </w:r>
+      <w:r>
+        <w:rPr>
+          <w:rFonts w:ascii="Courier New" w:hAnsi="Courier New" w:cs="Courier New"/>
+          <w:lang w:val="nl-NL"/>
+        </w:rPr>
+        <w:t xml:space="preserve">meer </w:t>
+      </w:r>
+      <w:proofErr w:type="gramStart"/>
+      <w:r>
+        <w:rPr>
+          <w:rFonts w:ascii="Courier New" w:hAnsi="Courier New" w:cs="Courier New"/>
+          <w:lang w:val="nl-NL"/>
+        </w:rPr>
+        <w:t xml:space="preserve">dan </w:t>
+      </w:r>
+      <w:r>
+        <w:rPr>
+          <w:rFonts w:ascii="Courier New" w:hAnsi="Courier New" w:cs="Courier New"/>
+          <w:lang w:val="nl-NL"/>
+        </w:rPr>
+        <w:t xml:space="preserve"> een</w:t>
+      </w:r>
+      <w:proofErr w:type="gramEnd"/>
+      <w:r>
+        <w:rPr>
+          <w:rFonts w:ascii="Courier New" w:hAnsi="Courier New" w:cs="Courier New"/>
+          <w:lang w:val="nl-NL"/>
+        </w:rPr>
+        <w:t xml:space="preserve"> populistische beweging die om </w:t>
       </w:r>
       <w:proofErr w:type="spellStart"/>
       <w:r>
@@ -310,23 +329,35 @@
           <w:rFonts w:ascii="Courier New" w:hAnsi="Courier New" w:cs="Courier New"/>
           <w:lang w:val="nl-NL"/>
         </w:rPr>
-        <w:t xml:space="preserve">. Achter </w:t>
-      </w:r>
-      <w:proofErr w:type="spellStart"/>
-      <w:r>
-        <w:rPr>
-          <w:rFonts w:ascii="Courier New" w:hAnsi="Courier New" w:cs="Courier New"/>
-          <w:lang w:val="nl-NL"/>
-        </w:rPr>
-        <w:t>Trump</w:t>
-      </w:r>
-      <w:proofErr w:type="spellEnd"/>
-      <w:r>
-        <w:rPr>
-          <w:rFonts w:ascii="Courier New" w:hAnsi="Courier New" w:cs="Courier New"/>
-          <w:lang w:val="nl-NL"/>
-        </w:rPr>
-        <w:t xml:space="preserve"> is een omvangrijk intellectueel landschap ontstaan van denkers, activisten en instellingen die proberen een ideologische rechtvaardiging te geven voor een fundamentele verandering van de Amerikaanse politieke orde. Field noemt dit </w:t>
+        <w:t xml:space="preserve">. </w:t>
+      </w:r>
+      <w:r>
+        <w:rPr>
+          <w:rFonts w:ascii="Courier New" w:hAnsi="Courier New" w:cs="Courier New"/>
+          <w:lang w:val="nl-NL"/>
+        </w:rPr>
+        <w:t>Er ligt</w:t>
+      </w:r>
+      <w:r>
+        <w:rPr>
+          <w:rFonts w:ascii="Courier New" w:hAnsi="Courier New" w:cs="Courier New"/>
+          <w:lang w:val="nl-NL"/>
+        </w:rPr>
+        <w:t xml:space="preserve"> een omvangrijk intellectueel landschap </w:t>
+      </w:r>
+      <w:r>
+        <w:rPr>
+          <w:rFonts w:ascii="Courier New" w:hAnsi="Courier New" w:cs="Courier New"/>
+          <w:lang w:val="nl-NL"/>
+        </w:rPr>
+        <w:t>achter</w:t>
+      </w:r>
+      <w:r>
+        <w:rPr>
+          <w:rFonts w:ascii="Courier New" w:hAnsi="Courier New" w:cs="Courier New"/>
+          <w:lang w:val="nl-NL"/>
+        </w:rPr>
+        <w:t xml:space="preserve"> van denkers, activisten en instellingen die proberen een ideologische rechtvaardiging te geven voor een fundamentele verandering van de Amerikaanse politieke orde. Field noemt dit </w:t>
       </w:r>
       <w:r>
         <w:rPr>
@@ -475,21 +506,49 @@
           <w:rFonts w:ascii="Courier New" w:hAnsi="Courier New" w:cs="Courier New"/>
           <w:lang w:val="nl-NL"/>
         </w:rPr>
-        <w:t xml:space="preserve"> en kon daardoor</w:t>
-      </w:r>
-      <w:r>
-        <w:rPr>
-          <w:rFonts w:ascii="Courier New" w:hAnsi="Courier New" w:cs="Courier New"/>
-          <w:lang w:val="nl-NL"/>
-        </w:rPr>
-        <w:t xml:space="preserve"> de ontwikkeling ervan van dichtbij volgen.</w:t>
-      </w:r>
-      <w:r>
-        <w:rPr>
-          <w:rFonts w:ascii="Courier New" w:hAnsi="Courier New" w:cs="Courier New"/>
-          <w:lang w:val="nl-NL"/>
-        </w:rPr>
-        <w:t xml:space="preserve"> Zij heeft er afstand van genomen.</w:t>
+        <w:t xml:space="preserve">. Zo kon ze </w:t>
+      </w:r>
+      <w:r>
+        <w:rPr>
+          <w:rFonts w:ascii="Courier New" w:hAnsi="Courier New" w:cs="Courier New"/>
+          <w:lang w:val="nl-NL"/>
+        </w:rPr>
+        <w:t>de ontwikkeling ervan van dichtbij volgen.</w:t>
+      </w:r>
+      <w:r>
+        <w:rPr>
+          <w:rFonts w:ascii="Courier New" w:hAnsi="Courier New" w:cs="Courier New"/>
+          <w:lang w:val="nl-NL"/>
+        </w:rPr>
+        <w:t xml:space="preserve"> Zij heeft er </w:t>
+      </w:r>
+      <w:r>
+        <w:rPr>
+          <w:rFonts w:ascii="Courier New" w:hAnsi="Courier New" w:cs="Courier New"/>
+          <w:lang w:val="nl-NL"/>
+        </w:rPr>
+        <w:t xml:space="preserve">ondertussen </w:t>
+      </w:r>
+      <w:r>
+        <w:rPr>
+          <w:rFonts w:ascii="Courier New" w:hAnsi="Courier New" w:cs="Courier New"/>
+          <w:lang w:val="nl-NL"/>
+        </w:rPr>
+        <w:t>afstand van genomen</w:t>
+      </w:r>
+      <w:r>
+        <w:rPr>
+          <w:rFonts w:ascii="Courier New" w:hAnsi="Courier New" w:cs="Courier New"/>
+          <w:lang w:val="nl-NL"/>
+        </w:rPr>
+        <w:t xml:space="preserve"> en rekent zichzelf tot de liberalen.</w:t>
+      </w:r>
+      <w:r>
+        <w:rPr>
+          <w:rFonts w:ascii="Courier New" w:hAnsi="Courier New" w:cs="Courier New"/>
+          <w:lang w:val="nl-NL"/>
+        </w:rPr>
+        <w:t xml:space="preserve"> </w:t>
       </w:r>
     </w:p>
     <w:p>
@@ -506,105 +565,37 @@
           <w:rFonts w:ascii="Courier New" w:hAnsi="Courier New" w:cs="Courier New"/>
           <w:lang w:val="nl-NL"/>
         </w:rPr>
-        <w:t xml:space="preserve">Een belangrijk keerpunt kwam in 2016 en 2017. Michael Anton, die behoort tot de West Coast </w:t>
-      </w:r>
-      <w:proofErr w:type="spellStart"/>
-      <w:r>
-        <w:rPr>
-          <w:rFonts w:ascii="Courier New" w:hAnsi="Courier New" w:cs="Courier New"/>
-          <w:lang w:val="nl-NL"/>
-        </w:rPr>
-        <w:t>Straussians</w:t>
-      </w:r>
-      <w:proofErr w:type="spellEnd"/>
-      <w:r>
-        <w:rPr>
-          <w:rFonts w:ascii="Courier New" w:hAnsi="Courier New" w:cs="Courier New"/>
-          <w:lang w:val="nl-NL"/>
-        </w:rPr>
-        <w:t xml:space="preserve"> en beïnvloed was </w:t>
-      </w:r>
-      <w:r>
-        <w:rPr>
-          <w:rFonts w:ascii="Courier New" w:hAnsi="Courier New" w:cs="Courier New"/>
-          <w:lang w:val="nl-NL"/>
-        </w:rPr>
         <w:lastRenderedPageBreak/>
-        <w:t xml:space="preserve">door Strauss' leerling Harry </w:t>
-      </w:r>
-      <w:proofErr w:type="spellStart"/>
-      <w:r>
-        <w:rPr>
-          <w:rFonts w:ascii="Courier New" w:hAnsi="Courier New" w:cs="Courier New"/>
-          <w:lang w:val="nl-NL"/>
-        </w:rPr>
-        <w:t>Jaffa</w:t>
-      </w:r>
-      <w:proofErr w:type="spellEnd"/>
-      <w:r>
-        <w:rPr>
-          <w:rFonts w:ascii="Courier New" w:hAnsi="Courier New" w:cs="Courier New"/>
-          <w:lang w:val="nl-NL"/>
-        </w:rPr>
-        <w:t xml:space="preserve">, ontwikkelde een intellectuele verdediging van </w:t>
-      </w:r>
-      <w:proofErr w:type="spellStart"/>
-      <w:r>
-        <w:rPr>
-          <w:rFonts w:ascii="Courier New" w:hAnsi="Courier New" w:cs="Courier New"/>
-          <w:lang w:val="nl-NL"/>
-        </w:rPr>
-        <w:t>Trump</w:t>
-      </w:r>
-      <w:proofErr w:type="spellEnd"/>
-      <w:r>
-        <w:rPr>
-          <w:rFonts w:ascii="Courier New" w:hAnsi="Courier New" w:cs="Courier New"/>
-          <w:lang w:val="nl-NL"/>
-        </w:rPr>
-        <w:t xml:space="preserve"> en het </w:t>
-      </w:r>
-      <w:proofErr w:type="spellStart"/>
-      <w:r>
-        <w:rPr>
-          <w:rFonts w:ascii="Courier New" w:hAnsi="Courier New" w:cs="Courier New"/>
-          <w:lang w:val="nl-NL"/>
-        </w:rPr>
-        <w:t>Trumpisme</w:t>
-      </w:r>
-      <w:proofErr w:type="spellEnd"/>
-      <w:r>
-        <w:rPr>
-          <w:rFonts w:ascii="Courier New" w:hAnsi="Courier New" w:cs="Courier New"/>
-          <w:lang w:val="nl-NL"/>
-        </w:rPr>
-        <w:t xml:space="preserve">. Field begon daarop intensief de nieuwe conservatieve intellectuele wereld te bestuderen, waaronder denkers als Patrick </w:t>
-      </w:r>
-      <w:proofErr w:type="spellStart"/>
-      <w:r>
-        <w:rPr>
-          <w:rFonts w:ascii="Courier New" w:hAnsi="Courier New" w:cs="Courier New"/>
-          <w:lang w:val="nl-NL"/>
-        </w:rPr>
-        <w:t>Deneen</w:t>
-      </w:r>
-      <w:proofErr w:type="spellEnd"/>
-      <w:r>
-        <w:rPr>
-          <w:rFonts w:ascii="Courier New" w:hAnsi="Courier New" w:cs="Courier New"/>
-          <w:lang w:val="nl-NL"/>
-        </w:rPr>
-        <w:t xml:space="preserve"> en </w:t>
-      </w:r>
-      <w:proofErr w:type="spellStart"/>
-      <w:r>
-        <w:rPr>
-          <w:rFonts w:ascii="Courier New" w:hAnsi="Courier New" w:cs="Courier New"/>
-          <w:lang w:val="nl-NL"/>
-        </w:rPr>
-        <w:t>Yoram</w:t>
-      </w:r>
-      <w:proofErr w:type="spellEnd"/>
+        <w:t xml:space="preserve">Na de bestorming van het Capitool op 6 januari 2021 verwachtte </w:t>
+      </w:r>
+      <w:r>
+        <w:rPr>
+          <w:rFonts w:ascii="Courier New" w:hAnsi="Courier New" w:cs="Courier New"/>
+          <w:lang w:val="nl-NL"/>
+        </w:rPr>
+        <w:t>Field eerst</w:t>
+      </w:r>
+      <w:r>
+        <w:rPr>
+          <w:rFonts w:ascii="Courier New" w:hAnsi="Courier New" w:cs="Courier New"/>
+          <w:lang w:val="nl-NL"/>
+        </w:rPr>
+        <w:t xml:space="preserve"> dat deze intellectuele beweging haar aantrekkingskracht zou verliezen</w:t>
+      </w:r>
+      <w:r>
+        <w:rPr>
+          <w:rFonts w:ascii="Courier New" w:hAnsi="Courier New" w:cs="Courier New"/>
+          <w:lang w:val="nl-NL"/>
+        </w:rPr>
+        <w:t>; h</w:t>
+      </w:r>
+      <w:r>
+        <w:rPr>
+          <w:rFonts w:ascii="Courier New" w:hAnsi="Courier New" w:cs="Courier New"/>
+          <w:lang w:val="nl-NL"/>
+        </w:rPr>
+        <w:t>et tegenovergestelde gebeurde. Daarom besloot ze een boekvoorstel te schrijven.</w:t>
+      </w:r>
       <w:r>
         <w:rPr>
           <w:rFonts w:ascii="Courier New" w:hAnsi="Courier New" w:cs="Courier New"/>
@@ -612,88 +603,19 @@
         </w:rPr>
         <w:t xml:space="preserve"> </w:t>
       </w:r>
-      <w:proofErr w:type="spellStart"/>
-      <w:r>
-        <w:rPr>
-          <w:rFonts w:ascii="Courier New" w:hAnsi="Courier New" w:cs="Courier New"/>
-          <w:lang w:val="nl-NL"/>
-        </w:rPr>
-        <w:t>Hazony</w:t>
-      </w:r>
-      <w:proofErr w:type="spellEnd"/>
-      <w:r>
-        <w:rPr>
-          <w:rFonts w:ascii="Courier New" w:hAnsi="Courier New" w:cs="Courier New"/>
-          <w:lang w:val="nl-NL"/>
-        </w:rPr>
-        <w:t xml:space="preserve">. Na de bestorming van het Capitool op 6 januari 2021 verwachtte </w:t>
-      </w:r>
-      <w:r>
-        <w:rPr>
-          <w:rFonts w:ascii="Courier New" w:hAnsi="Courier New" w:cs="Courier New"/>
-          <w:lang w:val="nl-NL"/>
-        </w:rPr>
-        <w:t>Field eerst</w:t>
-      </w:r>
-      <w:r>
-        <w:rPr>
-          <w:rFonts w:ascii="Courier New" w:hAnsi="Courier New" w:cs="Courier New"/>
-          <w:lang w:val="nl-NL"/>
-        </w:rPr>
-        <w:t xml:space="preserve"> dat deze intellectuele beweging haar aantrekkingskracht zou verliezen</w:t>
-      </w:r>
-      <w:r>
-        <w:rPr>
-          <w:rFonts w:ascii="Courier New" w:hAnsi="Courier New" w:cs="Courier New"/>
-          <w:lang w:val="nl-NL"/>
-        </w:rPr>
-        <w:t>; h</w:t>
-      </w:r>
-      <w:r>
-        <w:rPr>
-          <w:rFonts w:ascii="Courier New" w:hAnsi="Courier New" w:cs="Courier New"/>
-          <w:lang w:val="nl-NL"/>
-        </w:rPr>
-        <w:t>et tegenovergestelde gebeurde. Daarom besloot ze een boekvoorstel te schrijven.</w:t>
-      </w:r>
-      <w:r>
-        <w:rPr>
-          <w:rFonts w:ascii="Courier New" w:hAnsi="Courier New" w:cs="Courier New"/>
-          <w:lang w:val="nl-NL"/>
-        </w:rPr>
-        <w:t xml:space="preserve"> </w:t>
-      </w:r>
-      <w:proofErr w:type="spellStart"/>
-      <w:r>
-        <w:rPr>
-          <w:rFonts w:ascii="Courier New" w:hAnsi="Courier New" w:cs="Courier New"/>
-          <w:lang w:val="nl-NL"/>
-        </w:rPr>
-        <w:t>Furious</w:t>
-      </w:r>
-      <w:proofErr w:type="spellEnd"/>
-      <w:r>
-        <w:rPr>
-          <w:rFonts w:ascii="Courier New" w:hAnsi="Courier New" w:cs="Courier New"/>
-          <w:lang w:val="nl-NL"/>
-        </w:rPr>
-        <w:t xml:space="preserve"> </w:t>
-      </w:r>
-      <w:proofErr w:type="spellStart"/>
-      <w:r>
-        <w:rPr>
-          <w:rFonts w:ascii="Courier New" w:hAnsi="Courier New" w:cs="Courier New"/>
-          <w:lang w:val="nl-NL"/>
-        </w:rPr>
-        <w:t>Minds</w:t>
-      </w:r>
-      <w:proofErr w:type="spellEnd"/>
-      <w:r>
-        <w:rPr>
-          <w:rFonts w:ascii="Courier New" w:hAnsi="Courier New" w:cs="Courier New"/>
-          <w:lang w:val="nl-NL"/>
-        </w:rPr>
-        <w:t xml:space="preserve"> behandelt voornamelijk de periode 2016–2024. Field volgt de ontwikkeling van de beweging min of meer chronologisch en combineert politieke geschiedenis met portretten van belangrijke personen. Haar doel is niet alleen de ideeën van de beweging te bekritiseren, maar ze eerst zo helder en serieus mogelijk weer te geven.</w:t>
+      <w:r>
+        <w:rPr>
+          <w:rFonts w:ascii="Courier New" w:hAnsi="Courier New" w:cs="Courier New"/>
+          <w:lang w:val="nl-NL"/>
+        </w:rPr>
+        <w:t>Field volgt de ontwikkeling van de beweging min of meer chronologisch en combineert politieke geschiedenis met portretten van belangrijke personen. Haar doel is niet alleen de ideeën van de beweging te bekritiseren, maar ze eerst zo helder en serieus mogelijk weer te geven.</w:t>
+      </w:r>
+      <w:r>
+        <w:rPr>
+          <w:rFonts w:ascii="Courier New" w:hAnsi="Courier New" w:cs="Courier New"/>
+          <w:lang w:val="nl-NL"/>
+        </w:rPr>
+        <w:t xml:space="preserve"> Het is geen vrolijk boek om te lezen en soms heb je moeite om al die personen en waar ze voor staan uit elkaar te halen.</w:t>
       </w:r>
     </w:p>
     <w:p>
@@ -769,7 +691,21 @@
           <w:rFonts w:ascii="Courier New" w:hAnsi="Courier New" w:cs="Courier New"/>
           <w:lang w:val="nl-NL"/>
         </w:rPr>
-        <w:t xml:space="preserve">, vergelijkt Field haar met het traditionele Amerikaanse conservatisme. Dat conservatisme werd gedurende tientallen jaren bepaald door het zogenaamde </w:t>
+        <w:t>, vergelijkt Field haar met het traditionele Amerikaanse conservatisme. Da</w:t>
+      </w:r>
+      <w:r>
+        <w:rPr>
+          <w:rFonts w:ascii="Courier New" w:hAnsi="Courier New" w:cs="Courier New"/>
+          <w:lang w:val="nl-NL"/>
+        </w:rPr>
+        <w:t>t</w:t>
+      </w:r>
+      <w:r>
+        <w:rPr>
+          <w:rFonts w:ascii="Courier New" w:hAnsi="Courier New" w:cs="Courier New"/>
+          <w:lang w:val="nl-NL"/>
+        </w:rPr>
+        <w:t xml:space="preserve"> conservatisme werd gedurende tientallen jaren bepaald door het zogenaamde </w:t>
       </w:r>
       <w:r>
         <w:rPr>
@@ -1013,7 +949,49 @@
           <w:rFonts w:ascii="Courier New" w:hAnsi="Courier New" w:cs="Courier New"/>
           <w:lang w:val="nl-NL"/>
         </w:rPr>
-        <w:t xml:space="preserve"> van </w:t>
+        <w:t xml:space="preserve"> van Amerika-Eerst</w:t>
+      </w:r>
+      <w:r>
+        <w:rPr>
+          <w:rFonts w:ascii="Courier New" w:hAnsi="Courier New" w:cs="Courier New"/>
+          <w:lang w:val="nl-NL"/>
+        </w:rPr>
+        <w:t>.</w:t>
+      </w:r>
+      <w:r>
+        <w:rPr>
+          <w:rFonts w:ascii="Courier New" w:hAnsi="Courier New" w:cs="Courier New"/>
+          <w:lang w:val="nl-NL"/>
+        </w:rPr>
+        <w:t xml:space="preserve"> </w:t>
+      </w:r>
+      <w:r>
+        <w:rPr>
+          <w:rFonts w:ascii="Courier New" w:hAnsi="Courier New" w:cs="Courier New"/>
+          <w:lang w:val="nl-NL"/>
+        </w:rPr>
+        <w:t>Het</w:t>
+      </w:r>
+      <w:r>
+        <w:rPr>
+          <w:rFonts w:ascii="Courier New" w:hAnsi="Courier New" w:cs="Courier New"/>
+          <w:lang w:val="nl-NL"/>
+        </w:rPr>
+        <w:t xml:space="preserve"> conservatisme</w:t>
+      </w:r>
+      <w:r>
+        <w:rPr>
+          <w:rFonts w:ascii="Courier New" w:hAnsi="Courier New" w:cs="Courier New"/>
+          <w:lang w:val="nl-NL"/>
+        </w:rPr>
+        <w:t xml:space="preserve"> verandert hiermee</w:t>
+      </w:r>
+      <w:r>
+        <w:rPr>
+          <w:rFonts w:ascii="Courier New" w:hAnsi="Courier New" w:cs="Courier New"/>
+          <w:lang w:val="nl-NL"/>
+        </w:rPr>
+        <w:t xml:space="preserve">. Het vertrouwen in de vrije markt maakt plaats voor economisch nationalisme en protectionisme. Sociaal conservatisme blijft belangrijk, maar wordt volgens Field reactionairder en sterker </w:t>
       </w:r>
       <w:r>
         <w:rPr>
@@ -1021,49 +999,7 @@
           <w:lang w:val="nl-NL"/>
         </w:rPr>
         <w:lastRenderedPageBreak/>
-        <w:t>Amerika-Eerst</w:t>
-      </w:r>
-      <w:r>
-        <w:rPr>
-          <w:rFonts w:ascii="Courier New" w:hAnsi="Courier New" w:cs="Courier New"/>
-          <w:lang w:val="nl-NL"/>
-        </w:rPr>
-        <w:t>.</w:t>
-      </w:r>
-      <w:r>
-        <w:rPr>
-          <w:rFonts w:ascii="Courier New" w:hAnsi="Courier New" w:cs="Courier New"/>
-          <w:lang w:val="nl-NL"/>
-        </w:rPr>
-        <w:t xml:space="preserve"> </w:t>
-      </w:r>
-      <w:r>
-        <w:rPr>
-          <w:rFonts w:ascii="Courier New" w:hAnsi="Courier New" w:cs="Courier New"/>
-          <w:lang w:val="nl-NL"/>
-        </w:rPr>
-        <w:t>Het</w:t>
-      </w:r>
-      <w:r>
-        <w:rPr>
-          <w:rFonts w:ascii="Courier New" w:hAnsi="Courier New" w:cs="Courier New"/>
-          <w:lang w:val="nl-NL"/>
-        </w:rPr>
-        <w:t xml:space="preserve"> conservatisme</w:t>
-      </w:r>
-      <w:r>
-        <w:rPr>
-          <w:rFonts w:ascii="Courier New" w:hAnsi="Courier New" w:cs="Courier New"/>
-          <w:lang w:val="nl-NL"/>
-        </w:rPr>
-        <w:t xml:space="preserve"> verandert hiermee</w:t>
-      </w:r>
-      <w:r>
-        <w:rPr>
-          <w:rFonts w:ascii="Courier New" w:hAnsi="Courier New" w:cs="Courier New"/>
-          <w:lang w:val="nl-NL"/>
-        </w:rPr>
-        <w:t>. Het vertrouwen in de vrije markt maakt plaats voor economisch nationalisme en protectionisme. Sociaal conservatisme blijft belangrijk, maar wordt volgens Field reactionairder en sterker gericht op het herstellen van traditionele maatschappelijke en genderverhoudingen. Immigratie wordt bovendien een centraal politiek probleem. De bescherming van de grens is verbonden met de wens een traditionele Amerikaanse nationale identiteit te behouden.</w:t>
+        <w:t>gericht op het herstellen van traditionele maatschappelijke en genderverhoudingen. Immigratie wordt bovendien een centraal politiek probleem. De bescherming van de grens is verbonden met de wens een traditionele Amerikaanse nationale identiteit te behouden.</w:t>
       </w:r>
       <w:r>
         <w:rPr>
@@ -1305,7 +1241,6 @@
           <w:rFonts w:ascii="Courier New" w:hAnsi="Courier New" w:cs="Courier New"/>
           <w:lang w:val="nl-NL"/>
         </w:rPr>
-        <w:lastRenderedPageBreak/>
         <w:t>Claremonters</w:t>
       </w:r>
       <w:proofErr w:type="spellEnd"/>
@@ -1372,7 +1307,15 @@
           <w:rFonts w:ascii="Courier New" w:hAnsi="Courier New" w:cs="Courier New"/>
           <w:lang w:val="nl-NL"/>
         </w:rPr>
-        <w:t xml:space="preserve">. Bekende vertegenwoordigers zijn Patrick </w:t>
+        <w:t xml:space="preserve">. Bekende vertegenwoordigers zijn </w:t>
+      </w:r>
+      <w:r>
+        <w:rPr>
+          <w:rFonts w:ascii="Courier New" w:hAnsi="Courier New" w:cs="Courier New"/>
+          <w:lang w:val="nl-NL"/>
+        </w:rPr>
+        <w:lastRenderedPageBreak/>
+        <w:t xml:space="preserve">Patrick </w:t>
       </w:r>
       <w:proofErr w:type="spellStart"/>
       <w:r>
@@ -2010,15 +1953,7 @@
           <w:rFonts w:ascii="Courier New" w:hAnsi="Courier New" w:cs="Courier New"/>
           <w:lang w:val="nl-NL"/>
         </w:rPr>
-        <w:t xml:space="preserve"> hen volgens Field vooral onderscheidt, is de radicaliteit van hun </w:t>
-      </w:r>
-      <w:r>
-        <w:rPr>
-          <w:rFonts w:ascii="Courier New" w:hAnsi="Courier New" w:cs="Courier New"/>
-          <w:lang w:val="nl-NL"/>
-        </w:rPr>
-        <w:lastRenderedPageBreak/>
-        <w:t>retoriek. Geweld, autoritarisme en afwijzing van democratische normen worden hier openlijker besproken. Sommige vertegenwoordigers zijn volgens haar zelfs expliciet over hun affiniteit met fascistische denkbeelden.</w:t>
+        <w:t xml:space="preserve"> hen volgens Field vooral onderscheidt, is de radicaliteit van hun retoriek. Geweld, autoritarisme en afwijzing van democratische normen worden hier openlijker besproken. Sommige vertegenwoordigers zijn volgens haar zelfs expliciet over hun affiniteit met fascistische denkbeelden.</w:t>
       </w:r>
     </w:p>
     <w:p>
@@ -2035,6 +1970,7 @@
           <w:rFonts w:ascii="Courier New" w:hAnsi="Courier New" w:cs="Courier New"/>
           <w:lang w:val="nl-NL"/>
         </w:rPr>
+        <w:lastRenderedPageBreak/>
         <w:t xml:space="preserve">De </w:t>
       </w:r>
       <w:r>
@@ -2056,7 +1992,21 @@
           <w:rFonts w:ascii="Courier New" w:hAnsi="Courier New" w:cs="Courier New"/>
           <w:lang w:val="nl-NL"/>
         </w:rPr>
-        <w:t>niet mag worden afgedaan als een marginaal verschijnsel</w:t>
+        <w:t xml:space="preserve">mag </w:t>
+      </w:r>
+      <w:r>
+        <w:rPr>
+          <w:rFonts w:ascii="Courier New" w:hAnsi="Courier New" w:cs="Courier New"/>
+          <w:lang w:val="nl-NL"/>
+        </w:rPr>
+        <w:t xml:space="preserve">niet </w:t>
+      </w:r>
+      <w:r>
+        <w:rPr>
+          <w:rFonts w:ascii="Courier New" w:hAnsi="Courier New" w:cs="Courier New"/>
+          <w:lang w:val="nl-NL"/>
+        </w:rPr>
+        <w:t>worden afgedaan als een marginaal verschijnsel</w:t>
       </w:r>
       <w:r>
         <w:rPr>
@@ -2320,6 +2270,50 @@
           <w:lang w:val="nl-NL"/>
         </w:rPr>
         <w:t xml:space="preserve"> beweging intellectueel spannend, rebels en aantrekkelijk.</w:t>
+      </w:r>
+      <w:r>
+        <w:rPr>
+          <w:rFonts w:ascii="Courier New" w:hAnsi="Courier New" w:cs="Courier New"/>
+          <w:lang w:val="nl-NL"/>
+        </w:rPr>
+        <w:t xml:space="preserve"> </w:t>
+      </w:r>
+      <w:r>
+        <w:rPr>
+          <w:rFonts w:ascii="Courier New" w:hAnsi="Courier New" w:cs="Courier New"/>
+          <w:lang w:val="nl-NL"/>
+        </w:rPr>
+        <w:t xml:space="preserve">Ook als </w:t>
+      </w:r>
+      <w:proofErr w:type="spellStart"/>
+      <w:r>
+        <w:rPr>
+          <w:rFonts w:ascii="Courier New" w:hAnsi="Courier New" w:cs="Courier New"/>
+          <w:lang w:val="nl-NL"/>
+        </w:rPr>
+        <w:t>Trump</w:t>
+      </w:r>
+      <w:proofErr w:type="spellEnd"/>
+      <w:r>
+        <w:rPr>
+          <w:rFonts w:ascii="Courier New" w:hAnsi="Courier New" w:cs="Courier New"/>
+          <w:lang w:val="nl-NL"/>
+        </w:rPr>
+        <w:t xml:space="preserve"> </w:t>
+      </w:r>
+      <w:r>
+        <w:rPr>
+          <w:rFonts w:ascii="Courier New" w:hAnsi="Courier New" w:cs="Courier New"/>
+          <w:lang w:val="nl-NL"/>
+        </w:rPr>
+        <w:t xml:space="preserve">van het politieke toneel verdwijnt, zal deze groep </w:t>
+      </w:r>
+      <w:r>
+        <w:rPr>
+          <w:rFonts w:ascii="Courier New" w:hAnsi="Courier New" w:cs="Courier New"/>
+          <w:lang w:val="nl-NL"/>
+        </w:rPr>
+        <w:t>een belangrijke rol blijven spelen in de Amerikaanse politiek.</w:t>
       </w:r>
     </w:p>
     <w:p>
@@ -2631,6 +2625,49 @@
           <w:rFonts w:ascii="Courier New" w:hAnsi="Courier New" w:cs="Courier New"/>
           <w:lang w:val="nl-NL"/>
         </w:rPr>
+        <w:t xml:space="preserve"> bestaat uit verschillende en soms onderling botsende groepen</w:t>
+      </w:r>
+      <w:r>
+        <w:rPr>
+          <w:rFonts w:ascii="Courier New" w:hAnsi="Courier New" w:cs="Courier New"/>
+          <w:lang w:val="nl-NL"/>
+        </w:rPr>
+        <w:t>. Z</w:t>
+      </w:r>
+      <w:r>
+        <w:rPr>
+          <w:rFonts w:ascii="Courier New" w:hAnsi="Courier New" w:cs="Courier New"/>
+          <w:lang w:val="nl-NL"/>
+        </w:rPr>
+        <w:t xml:space="preserve">ij delen </w:t>
+      </w:r>
+      <w:r>
+        <w:rPr>
+          <w:rFonts w:ascii="Courier New" w:hAnsi="Courier New" w:cs="Courier New"/>
+          <w:lang w:val="nl-NL"/>
+        </w:rPr>
+        <w:t xml:space="preserve">wel </w:t>
+      </w:r>
+      <w:r>
+        <w:rPr>
+          <w:rFonts w:ascii="Courier New" w:hAnsi="Courier New" w:cs="Courier New"/>
+          <w:lang w:val="nl-NL"/>
+        </w:rPr>
+        <w:t xml:space="preserve">een fundamentele onvrede met de liberale orde en zoeken </w:t>
+      </w:r>
+      <w:r>
+        <w:rPr>
+          <w:rFonts w:ascii="Courier New" w:hAnsi="Courier New" w:cs="Courier New"/>
+          <w:lang w:val="nl-NL"/>
+        </w:rPr>
+        <w:lastRenderedPageBreak/>
+        <w:t>naar alternatieven waarin natie, gemeenschap, traditie, religie, hiërarchie en sterke politieke macht een grotere rol krijgen.</w:t>
+      </w:r>
+      <w:r>
+        <w:rPr>
+          <w:rFonts w:ascii="Courier New" w:hAnsi="Courier New" w:cs="Courier New"/>
+          <w:lang w:val="nl-NL"/>
+        </w:rPr>
         <w:t xml:space="preserve"> </w:t>
       </w:r>
       <w:r>
@@ -2638,73 +2675,7 @@
           <w:rFonts w:ascii="Courier New" w:hAnsi="Courier New" w:cs="Courier New"/>
           <w:lang w:val="nl-NL"/>
         </w:rPr>
-        <w:lastRenderedPageBreak/>
-        <w:t>bestaat uit verschillende en soms onderling botsende groepen</w:t>
-      </w:r>
-      <w:r>
-        <w:rPr>
-          <w:rFonts w:ascii="Courier New" w:hAnsi="Courier New" w:cs="Courier New"/>
-          <w:lang w:val="nl-NL"/>
-        </w:rPr>
-        <w:t>. Z</w:t>
-      </w:r>
-      <w:r>
-        <w:rPr>
-          <w:rFonts w:ascii="Courier New" w:hAnsi="Courier New" w:cs="Courier New"/>
-          <w:lang w:val="nl-NL"/>
-        </w:rPr>
-        <w:t xml:space="preserve">ij delen </w:t>
-      </w:r>
-      <w:r>
-        <w:rPr>
-          <w:rFonts w:ascii="Courier New" w:hAnsi="Courier New" w:cs="Courier New"/>
-          <w:lang w:val="nl-NL"/>
-        </w:rPr>
-        <w:t xml:space="preserve">wel </w:t>
-      </w:r>
-      <w:r>
-        <w:rPr>
-          <w:rFonts w:ascii="Courier New" w:hAnsi="Courier New" w:cs="Courier New"/>
-          <w:lang w:val="nl-NL"/>
-        </w:rPr>
-        <w:t>een fundamentele onvrede met de liberale orde en zoeken naar alternatieven waarin natie, gemeenschap, traditie, religie, hiërarchie en sterke politieke macht een grotere rol krijgen.</w:t>
-      </w:r>
-      <w:r>
-        <w:rPr>
-          <w:rFonts w:ascii="Courier New" w:hAnsi="Courier New" w:cs="Courier New"/>
-          <w:lang w:val="nl-NL"/>
-        </w:rPr>
-        <w:t xml:space="preserve"> Ook als </w:t>
-      </w:r>
-      <w:proofErr w:type="spellStart"/>
-      <w:r>
-        <w:rPr>
-          <w:rFonts w:ascii="Courier New" w:hAnsi="Courier New" w:cs="Courier New"/>
-          <w:lang w:val="nl-NL"/>
-        </w:rPr>
-        <w:t>Trump</w:t>
-      </w:r>
-      <w:proofErr w:type="spellEnd"/>
-      <w:r>
-        <w:rPr>
-          <w:rFonts w:ascii="Courier New" w:hAnsi="Courier New" w:cs="Courier New"/>
-          <w:lang w:val="nl-NL"/>
-        </w:rPr>
-        <w:t xml:space="preserve"> </w:t>
-      </w:r>
-      <w:r>
-        <w:rPr>
-          <w:rFonts w:ascii="Courier New" w:hAnsi="Courier New" w:cs="Courier New"/>
-          <w:lang w:val="nl-NL"/>
-        </w:rPr>
-        <w:t xml:space="preserve">van het politieke toneel verdwijnt, zal deze groep </w:t>
-      </w:r>
-      <w:r>
-        <w:rPr>
-          <w:rFonts w:ascii="Courier New" w:hAnsi="Courier New" w:cs="Courier New"/>
-          <w:lang w:val="nl-NL"/>
-        </w:rPr>
-        <w:t xml:space="preserve">een belangrijke rol blijven spelen in de Amerikaanse politiek. Wie de toekomstige ontwikkeling van de Verenigde Staten wil begrijpen, moet daarom niet alleen naar verkiezingen en naar </w:t>
+        <w:t xml:space="preserve">Wie de toekomstige ontwikkeling van de Verenigde Staten wil begrijpen, moet daarom niet alleen naar verkiezingen en naar </w:t>
       </w:r>
       <w:proofErr w:type="spellStart"/>
       <w:r>
@@ -2753,6 +2724,7 @@
         <w:spacing w:after="120" w:line="360" w:lineRule="auto"/>
         <w:rPr>
           <w:rFonts w:ascii="Courier New" w:hAnsi="Courier New" w:cs="Courier New"/>
+          <w:lang w:val="nl-NL"/>
         </w:rPr>
       </w:pPr>
       <w:r>
@@ -2779,6 +2751,7 @@
       <w:r>
         <w:rPr>
           <w:rFonts w:ascii="Courier New" w:hAnsi="Courier New" w:cs="Courier New"/>
+          <w:lang w:val="nl-NL"/>
         </w:rPr>
         <w:t>Princeton&amp;Oxford</w:t>
       </w:r>
@@ -2786,23 +2759,17 @@
       <w:r>
         <w:rPr>
           <w:rFonts w:ascii="Courier New" w:hAnsi="Courier New" w:cs="Courier New"/>
-        </w:rPr>
-        <w:t xml:space="preserve">: Princeton University Press. 423 </w:t>
-      </w:r>
-      <w:proofErr w:type="spellStart"/>
-      <w:r>
-        <w:rPr>
-          <w:rFonts w:ascii="Courier New" w:hAnsi="Courier New" w:cs="Courier New"/>
-        </w:rPr>
-        <w:t>pagina’s</w:t>
-      </w:r>
-      <w:proofErr w:type="spellEnd"/>
+          <w:lang w:val="nl-NL"/>
+        </w:rPr>
+        <w:t>: Princeton University Press. 423 pagina’s</w:t>
+      </w:r>
     </w:p>
     <w:p>
       <w:pPr>
         <w:spacing w:line="360" w:lineRule="auto"/>
         <w:rPr>
           <w:rFonts w:ascii="Courier New" w:hAnsi="Courier New" w:cs="Courier New"/>
+          <w:lang w:val="nl-NL"/>
         </w:rPr>
       </w:pPr>
     </w:p>
@@ -2915,15 +2882,7 @@
           <w:rFonts w:ascii="Courier New" w:hAnsi="Courier New" w:cs="Courier New"/>
           <w:lang w:val="nl-NL"/>
         </w:rPr>
-        <w:t xml:space="preserve">Daartegenover plaatst Field haar liberale pluralisme. De moderne Verenigde Staten kennen zoveel verschillende morele en levensbeschouwelijke overtuigingen dat geen enkele visie op het goede leven politieke voorrang behoort te krijgen. Zelfs als er een objectief juiste moraal zou bestaan, zou het volgens deze </w:t>
-      </w:r>
-      <w:r>
-        <w:rPr>
-          <w:rFonts w:ascii="Courier New" w:hAnsi="Courier New" w:cs="Courier New"/>
-          <w:lang w:val="nl-NL"/>
-        </w:rPr>
-        <w:lastRenderedPageBreak/>
-        <w:t xml:space="preserve">benadering onrechtvaardig zijn haar aan andersdenkenden op te leggen. </w:t>
+        <w:t xml:space="preserve">Daartegenover plaatst Field haar liberale pluralisme. De moderne Verenigde Staten kennen zoveel verschillende morele en levensbeschouwelijke overtuigingen dat geen enkele visie op het goede leven politieke voorrang behoort te krijgen. Zelfs als er een objectief juiste moraal zou bestaan, zou het volgens deze benadering onrechtvaardig zijn haar aan andersdenkenden op te leggen. </w:t>
       </w:r>
       <w:proofErr w:type="spellStart"/>
       <w:r>
@@ -2955,6 +2914,7 @@
           <w:rFonts w:ascii="Courier New" w:hAnsi="Courier New" w:cs="Courier New"/>
           <w:lang w:val="nl-NL"/>
         </w:rPr>
+        <w:lastRenderedPageBreak/>
         <w:t>De recensent vindt echter dat Field de intellectuele argumenten van Nieuw Rechts onvoldoende serieus behandelt. Hoewel zij zegt hun ideeën eerlijk te willen beoordelen, reageert zij volgens hem geregeld met spot, persoonlijke afwijzing en kwalificaties in plaats van uitvoerige argumentatie. Vooral wanneer conservatieven klassieke bezwaren tegen relativisme en tolerantie formuleren, zou Field te gemakkelijk aannemen dat liberale filosofen daarop overtuigende antwoorden hebben zonder die antwoorden zelf uit te werken. Daardoor ontstaat volgens de recensent een spanning tussen Fields verdediging van openheid en pluralisme en haar geringe bereidheid om de argumenten van haar tegenstanders werkelijk te onderzoeken.</w:t>
       </w:r>
     </w:p>
@@ -3067,15 +3027,7 @@
           <w:rFonts w:ascii="Courier New" w:hAnsi="Courier New" w:cs="Courier New"/>
           <w:lang w:val="nl-NL"/>
         </w:rPr>
-        <w:t xml:space="preserve"> onvoldoende verklaart waarom Nieuw Rechts zoveel aantrekkingskracht heeft gekregen. Als de analyses van deze beweging werkelijk zo gebrekkig zijn als Field beweert, blijft de vraag waarom steeds meer Amerikanen er toch ontvankelijk voor zijn. Verklaringen die vooral verwijzen naar racisme, blank suprematisme of vatbaarheid voor politieke mythes vindt de </w:t>
-      </w:r>
-      <w:r>
-        <w:rPr>
-          <w:rFonts w:ascii="Courier New" w:hAnsi="Courier New" w:cs="Courier New"/>
-          <w:lang w:val="nl-NL"/>
-        </w:rPr>
-        <w:lastRenderedPageBreak/>
-        <w:t>recensent ontoereikend. Ook onjuiste politieke overtuigingen moeten vanuit hun maatschappelijke voedingsbodem worden begrepen.</w:t>
+        <w:t xml:space="preserve"> onvoldoende verklaart waarom Nieuw Rechts zoveel aantrekkingskracht heeft gekregen. Als de analyses van deze beweging werkelijk zo gebrekkig zijn als Field beweert, blijft de vraag waarom steeds meer Amerikanen er toch ontvankelijk voor zijn. Verklaringen die vooral verwijzen naar racisme, blank suprematisme of vatbaarheid voor politieke mythes vindt de recensent ontoereikend. Ook onjuiste politieke overtuigingen moeten vanuit hun maatschappelijke voedingsbodem worden begrepen.</w:t>
       </w:r>
     </w:p>
     <w:p>
@@ -3091,6 +3043,7 @@
           <w:rFonts w:ascii="Courier New" w:hAnsi="Courier New" w:cs="Courier New"/>
           <w:lang w:val="nl-NL"/>
         </w:rPr>
+        <w:lastRenderedPageBreak/>
         <w:t>Volgens de recensie ligt een belangrijk deel van die voedingsbodem in de ervaring dat het liberale pluralisme in de praktijk minder pluralistisch is dan het zichzelf presenteert. Vooral jongere Amerikanen zouden op universiteiten, in bedrijven en publieke instellingen hebben ervaren dat progressieve opvattingen over ras, diversiteit, identiteit en moraal steeds vaker als vanzelfsprekende normen werden opgelegd. Terwijl liberalen beweren dat de overheid en publieke instellingen geen omvattende moraal mogen voorschrijven, ervaren conservatieven volgens de recensent juist een toenemende progressieve morele homogeniteit. Vanuit dat perspectief wordt de aantrekkingskracht van Nieuw Rechts begrijpelijker: het geeft woorden aan het gevoel dat het beloofde pluralisme niet werkelijk bestaat.</w:t>
       </w:r>
     </w:p>
@@ -4055,6 +4008,7 @@
   <w:style w:type="character" w:default="1" w:styleId="DefaultParagraphFont">
     <w:name w:val="Default Paragraph Font"/>
     <w:uiPriority w:val="1"/>
+    <w:semiHidden/>
     <w:unhideWhenUsed/>
   </w:style>
   <w:style w:type="table" w:default="1" w:styleId="TableNormal">

</xml_diff>